<commit_message>
Refactor: Cambiso chicos en mini-informes, codigo intacto
</commit_message>
<xml_diff>
--- a/actividad_3-STOP&WAIT/mini_informe_act_3.docx
+++ b/actividad_3-STOP&WAIT/mini_informe_act_3.docx
@@ -207,32 +207,23 @@
         <w:rPr>
           <w:b/>
           <w:bCs/>
-          <w:lang w:val="en-US"/>
-        </w:rPr>
-      </w:pPr>
+        </w:rPr>
+      </w:pPr>
+      <w:proofErr w:type="spellStart"/>
+      <w:proofErr w:type="gramStart"/>
       <w:r>
         <w:rPr>
           <w:b/>
           <w:bCs/>
-          <w:lang w:val="en-US"/>
-        </w:rPr>
-        <w:t>Mini-</w:t>
-      </w:r>
-      <w:proofErr w:type="spellStart"/>
+        </w:rPr>
+        <w:t>Mini-informe</w:t>
+      </w:r>
+      <w:proofErr w:type="spellEnd"/>
+      <w:proofErr w:type="gramEnd"/>
       <w:r>
         <w:rPr>
           <w:b/>
           <w:bCs/>
-          <w:lang w:val="en-US"/>
-        </w:rPr>
-        <w:t>informe</w:t>
-      </w:r>
-      <w:proofErr w:type="spellEnd"/>
-      <w:r>
-        <w:rPr>
-          <w:b/>
-          <w:bCs/>
-          <w:lang w:val="en-US"/>
         </w:rPr>
         <w:t xml:space="preserve"> Stop &amp; Wait</w:t>
       </w:r>
@@ -240,65 +231,41 @@
     <w:p>
       <w:pPr>
         <w:jc w:val="center"/>
-        <w:rPr>
-          <w:lang w:val="en-US"/>
-        </w:rPr>
-      </w:pPr>
-    </w:p>
-    <w:p>
-      <w:pPr>
-        <w:jc w:val="center"/>
-        <w:rPr>
-          <w:lang w:val="en-US"/>
-        </w:rPr>
-      </w:pPr>
-    </w:p>
-    <w:p>
-      <w:pPr>
-        <w:jc w:val="center"/>
-        <w:rPr>
-          <w:lang w:val="en-US"/>
-        </w:rPr>
-      </w:pPr>
-    </w:p>
-    <w:p>
-      <w:pPr>
-        <w:jc w:val="center"/>
-        <w:rPr>
-          <w:lang w:val="en-US"/>
-        </w:rPr>
-      </w:pPr>
-    </w:p>
-    <w:p>
-      <w:pPr>
-        <w:jc w:val="center"/>
-        <w:rPr>
-          <w:lang w:val="en-US"/>
-        </w:rPr>
-      </w:pPr>
-    </w:p>
-    <w:p>
-      <w:pPr>
-        <w:jc w:val="center"/>
-        <w:rPr>
-          <w:lang w:val="en-US"/>
-        </w:rPr>
-      </w:pPr>
-    </w:p>
-    <w:p>
-      <w:pPr>
-        <w:jc w:val="center"/>
-        <w:rPr>
-          <w:lang w:val="en-US"/>
-        </w:rPr>
-      </w:pPr>
-    </w:p>
-    <w:p>
-      <w:pPr>
-        <w:jc w:val="center"/>
-        <w:rPr>
-          <w:lang w:val="en-US"/>
-        </w:rPr>
+      </w:pPr>
+    </w:p>
+    <w:p>
+      <w:pPr>
+        <w:jc w:val="center"/>
+      </w:pPr>
+    </w:p>
+    <w:p>
+      <w:pPr>
+        <w:jc w:val="center"/>
+      </w:pPr>
+    </w:p>
+    <w:p>
+      <w:pPr>
+        <w:jc w:val="center"/>
+      </w:pPr>
+    </w:p>
+    <w:p>
+      <w:pPr>
+        <w:jc w:val="center"/>
+      </w:pPr>
+    </w:p>
+    <w:p>
+      <w:pPr>
+        <w:jc w:val="center"/>
+      </w:pPr>
+    </w:p>
+    <w:p>
+      <w:pPr>
+        <w:jc w:val="center"/>
+      </w:pPr>
+    </w:p>
+    <w:p>
+      <w:pPr>
+        <w:jc w:val="center"/>
       </w:pPr>
     </w:p>
     <w:p>
@@ -639,6 +606,7 @@
       </w:pPr>
       <w:r>
         <w:rPr>
+          <w:noProof/>
           <w:lang w:val="en-US"/>
         </w:rPr>
         <w:drawing>
@@ -823,6 +791,7 @@
       </w:pPr>
       <w:r>
         <w:rPr>
+          <w:noProof/>
           <w:lang w:val="en-US"/>
         </w:rPr>
         <w:drawing>
@@ -987,6 +956,7 @@
         <w:rPr>
           <w:b/>
           <w:bCs/>
+          <w:noProof/>
           <w:u w:val="single"/>
           <w:lang w:val="en-US"/>
         </w:rPr>
@@ -1066,6 +1036,9 @@
         <w:jc w:val="center"/>
       </w:pPr>
       <w:r>
+        <w:rPr>
+          <w:noProof/>
+        </w:rPr>
         <w:drawing>
           <wp:inline distT="0" distB="0" distL="0" distR="0" wp14:anchorId="5CE7B8D5" wp14:editId="40AAADB4">
             <wp:extent cx="3629052" cy="1676412"/>
@@ -1168,6 +1141,9 @@
         <w:jc w:val="center"/>
       </w:pPr>
       <w:r>
+        <w:rPr>
+          <w:noProof/>
+        </w:rPr>
         <w:drawing>
           <wp:inline distT="0" distB="0" distL="0" distR="0" wp14:anchorId="6CB65AD1" wp14:editId="2AC70780">
             <wp:extent cx="3724302" cy="3781453"/>
@@ -1316,6 +1292,69 @@
       <w:pPr>
         <w:jc w:val="both"/>
       </w:pPr>
+      <w:r>
+        <w:rPr>
+          <w:noProof/>
+        </w:rPr>
+        <w:drawing>
+          <wp:inline distT="0" distB="0" distL="0" distR="0" wp14:anchorId="532015C4" wp14:editId="29D25E72">
+            <wp:extent cx="5570220" cy="3578860"/>
+            <wp:effectExtent l="0" t="0" r="0" b="2540"/>
+            <wp:docPr id="2129177314" name="Imagen 4"/>
+            <wp:cNvGraphicFramePr>
+              <a:graphicFrameLocks xmlns:a="http://schemas.openxmlformats.org/drawingml/2006/main" noChangeAspect="1"/>
+            </wp:cNvGraphicFramePr>
+            <a:graphic xmlns:a="http://schemas.openxmlformats.org/drawingml/2006/main">
+              <a:graphicData uri="http://schemas.openxmlformats.org/drawingml/2006/picture">
+                <pic:pic xmlns:pic="http://schemas.openxmlformats.org/drawingml/2006/picture">
+                  <pic:nvPicPr>
+                    <pic:cNvPr id="0" name="Picture 4"/>
+                    <pic:cNvPicPr>
+                      <a:picLocks noChangeAspect="1" noChangeArrowheads="1"/>
+                    </pic:cNvPicPr>
+                  </pic:nvPicPr>
+                  <pic:blipFill>
+                    <a:blip r:embed="rId13">
+                      <a:extLst>
+                        <a:ext uri="{28A0092B-C50C-407E-A947-70E740481C1C}">
+                          <a14:useLocalDpi xmlns:a14="http://schemas.microsoft.com/office/drawing/2010/main" val="0"/>
+                        </a:ext>
+                      </a:extLst>
+                    </a:blip>
+                    <a:srcRect/>
+                    <a:stretch>
+                      <a:fillRect/>
+                    </a:stretch>
+                  </pic:blipFill>
+                  <pic:spPr bwMode="auto">
+                    <a:xfrm>
+                      <a:off x="0" y="0"/>
+                      <a:ext cx="5570220" cy="3578860"/>
+                    </a:xfrm>
+                    <a:prstGeom prst="rect">
+                      <a:avLst/>
+                    </a:prstGeom>
+                    <a:noFill/>
+                    <a:ln>
+                      <a:noFill/>
+                    </a:ln>
+                  </pic:spPr>
+                </pic:pic>
+              </a:graphicData>
+            </a:graphic>
+          </wp:inline>
+        </w:drawing>
+      </w:r>
+    </w:p>
+    <w:p>
+      <w:pPr>
+        <w:jc w:val="both"/>
+      </w:pPr>
+    </w:p>
+    <w:p>
+      <w:pPr>
+        <w:jc w:val="both"/>
+      </w:pPr>
     </w:p>
     <w:p>
       <w:pPr>
@@ -1362,6 +1401,7 @@
           <w:bCs/>
           <w:u w:val="single"/>
         </w:rPr>
+        <w:lastRenderedPageBreak/>
         <w:t>Cierre de conexiones:</w:t>
       </w:r>
     </w:p>
@@ -1370,11 +1410,13 @@
         <w:jc w:val="center"/>
       </w:pPr>
       <w:r>
-        <w:lastRenderedPageBreak/>
+        <w:rPr>
+          <w:noProof/>
+        </w:rPr>
         <w:drawing>
-          <wp:inline distT="0" distB="0" distL="0" distR="0" wp14:anchorId="059BEDBB" wp14:editId="49FBCC7D">
-            <wp:extent cx="4372007" cy="4238656"/>
-            <wp:effectExtent l="0" t="0" r="9525" b="9525"/>
+          <wp:inline distT="0" distB="0" distL="0" distR="0" wp14:anchorId="059BEDBB" wp14:editId="76F4F121">
+            <wp:extent cx="4237703" cy="4108448"/>
+            <wp:effectExtent l="0" t="0" r="0" b="6985"/>
             <wp:docPr id="408579038" name="Imagen 1"/>
             <wp:cNvGraphicFramePr>
               <a:graphicFrameLocks xmlns:a="http://schemas.openxmlformats.org/drawingml/2006/main" noChangeAspect="1"/>
@@ -1387,7 +1429,7 @@
                     <pic:cNvPicPr/>
                   </pic:nvPicPr>
                   <pic:blipFill>
-                    <a:blip r:embed="rId13"/>
+                    <a:blip r:embed="rId14"/>
                     <a:stretch>
                       <a:fillRect/>
                     </a:stretch>
@@ -1395,7 +1437,7 @@
                   <pic:spPr>
                     <a:xfrm>
                       <a:off x="0" y="0"/>
-                      <a:ext cx="4372007" cy="4238656"/>
+                      <a:ext cx="4246785" cy="4117253"/>
                     </a:xfrm>
                     <a:prstGeom prst="rect">
                       <a:avLst/>
@@ -1413,6 +1455,9 @@
         <w:jc w:val="center"/>
       </w:pPr>
       <w:r>
+        <w:rPr>
+          <w:noProof/>
+        </w:rPr>
         <w:drawing>
           <wp:inline distT="0" distB="0" distL="0" distR="0" wp14:anchorId="7555529F" wp14:editId="654F97E5">
             <wp:extent cx="3914804" cy="3571901"/>
@@ -1429,7 +1474,7 @@
                     <pic:cNvPicPr/>
                   </pic:nvPicPr>
                   <pic:blipFill>
-                    <a:blip r:embed="rId14"/>
+                    <a:blip r:embed="rId15"/>
                     <a:stretch>
                       <a:fillRect/>
                     </a:stretch>
@@ -1481,6 +1526,59 @@
       <w:pPr>
         <w:jc w:val="both"/>
       </w:pPr>
+      <w:r>
+        <w:rPr>
+          <w:noProof/>
+        </w:rPr>
+        <w:drawing>
+          <wp:inline distT="0" distB="0" distL="0" distR="0" wp14:anchorId="744BF31C" wp14:editId="409A6FEA">
+            <wp:extent cx="5609590" cy="3804920"/>
+            <wp:effectExtent l="0" t="0" r="0" b="5080"/>
+            <wp:docPr id="2034047960" name="Imagen 3"/>
+            <wp:cNvGraphicFramePr>
+              <a:graphicFrameLocks xmlns:a="http://schemas.openxmlformats.org/drawingml/2006/main" noChangeAspect="1"/>
+            </wp:cNvGraphicFramePr>
+            <a:graphic xmlns:a="http://schemas.openxmlformats.org/drawingml/2006/main">
+              <a:graphicData uri="http://schemas.openxmlformats.org/drawingml/2006/picture">
+                <pic:pic xmlns:pic="http://schemas.openxmlformats.org/drawingml/2006/picture">
+                  <pic:nvPicPr>
+                    <pic:cNvPr id="0" name="Picture 3"/>
+                    <pic:cNvPicPr>
+                      <a:picLocks noChangeAspect="1" noChangeArrowheads="1"/>
+                    </pic:cNvPicPr>
+                  </pic:nvPicPr>
+                  <pic:blipFill>
+                    <a:blip r:embed="rId16" cstate="print">
+                      <a:extLst>
+                        <a:ext uri="{28A0092B-C50C-407E-A947-70E740481C1C}">
+                          <a14:useLocalDpi xmlns:a14="http://schemas.microsoft.com/office/drawing/2010/main" val="0"/>
+                        </a:ext>
+                      </a:extLst>
+                    </a:blip>
+                    <a:srcRect/>
+                    <a:stretch>
+                      <a:fillRect/>
+                    </a:stretch>
+                  </pic:blipFill>
+                  <pic:spPr bwMode="auto">
+                    <a:xfrm>
+                      <a:off x="0" y="0"/>
+                      <a:ext cx="5609590" cy="3804920"/>
+                    </a:xfrm>
+                    <a:prstGeom prst="rect">
+                      <a:avLst/>
+                    </a:prstGeom>
+                    <a:noFill/>
+                    <a:ln>
+                      <a:noFill/>
+                    </a:ln>
+                  </pic:spPr>
+                </pic:pic>
+              </a:graphicData>
+            </a:graphic>
+          </wp:inline>
+        </w:drawing>
+      </w:r>
     </w:p>
     <w:sectPr>
       <w:pgSz w:w="12240" w:h="15840"/>
@@ -2252,6 +2350,7 @@
   <w:style w:type="character" w:default="1" w:styleId="Fuentedeprrafopredeter">
     <w:name w:val="Default Paragraph Font"/>
     <w:uiPriority w:val="1"/>
+    <w:semiHidden/>
     <w:unhideWhenUsed/>
   </w:style>
   <w:style w:type="table" w:default="1" w:styleId="Tablanormal">

</xml_diff>